<commit_message>
Align Results hypothesis numbering to Theory section (H1=UE->BSUC, H2=UX->BSUC, H3=mediation)
</commit_message>
<xml_diff>
--- a/Results_BSRS_JMIS.docx
+++ b/Results_BSRS_JMIS.docx
@@ -7871,15 +7871,18 @@
             <w:pPr>
               <w:jc w:val="center"/>
             </w:pPr>
-            <w:r/>
+            <w:r>
+              <w:rPr>
+                <w:color w:val="FFFFFF"/>
+              </w:rPr>
+            </w:r>
             <w:r>
               <w:rPr>
                 <w:rFonts w:ascii="Times New Roman" w:hAnsi="Times New Roman"/>
                 <w:b/>
-                <w:color w:val="FFFFFF"/>
-                <w:sz w:val="18"/>
-              </w:rPr>
-              <w:t>H</w:t>
+                <w:sz w:val="18"/>
+              </w:rPr>
+              <w:t>Effect</w:t>
             </w:r>
           </w:p>
         </w:tc>
@@ -8062,9 +8065,10 @@
             <w:r>
               <w:rPr>
                 <w:rFonts w:ascii="Times New Roman" w:hAnsi="Times New Roman"/>
-                <w:sz w:val="18"/>
-              </w:rPr>
-              <w:t>H1</w:t>
+                <w:b w:val="0"/>
+                <w:sz w:val="18"/>
+              </w:rPr>
+              <w:t>a₁</w:t>
             </w:r>
           </w:p>
         </w:tc>
@@ -8182,9 +8186,10 @@
             <w:r>
               <w:rPr>
                 <w:rFonts w:ascii="Times New Roman" w:hAnsi="Times New Roman"/>
-                <w:sz w:val="18"/>
-              </w:rPr>
-              <w:t>Supported</w:t>
+                <w:b w:val="0"/>
+                <w:sz w:val="18"/>
+              </w:rPr>
+              <w:t>Significant</w:t>
             </w:r>
           </w:p>
         </w:tc>
@@ -8199,9 +8204,10 @@
             <w:r>
               <w:rPr>
                 <w:rFonts w:ascii="Times New Roman" w:hAnsi="Times New Roman"/>
-                <w:sz w:val="18"/>
-              </w:rPr>
-              <w:t>H2</w:t>
+                <w:b w:val="0"/>
+                <w:sz w:val="18"/>
+              </w:rPr>
+              <w:t>a₂</w:t>
             </w:r>
           </w:p>
         </w:tc>
@@ -8319,9 +8325,10 @@
             <w:r>
               <w:rPr>
                 <w:rFonts w:ascii="Times New Roman" w:hAnsi="Times New Roman"/>
-                <w:sz w:val="18"/>
-              </w:rPr>
-              <w:t>Supported</w:t>
+                <w:b w:val="0"/>
+                <w:sz w:val="18"/>
+              </w:rPr>
+              <w:t>Significant</w:t>
             </w:r>
           </w:p>
         </w:tc>
@@ -8336,9 +8343,10 @@
             <w:r>
               <w:rPr>
                 <w:rFonts w:ascii="Times New Roman" w:hAnsi="Times New Roman"/>
-                <w:sz w:val="18"/>
-              </w:rPr>
-              <w:t>H5</w:t>
+                <w:b w:val="0"/>
+                <w:sz w:val="18"/>
+              </w:rPr>
+              <w:t>b</w:t>
             </w:r>
           </w:p>
         </w:tc>
@@ -8456,9 +8464,10 @@
             <w:r>
               <w:rPr>
                 <w:rFonts w:ascii="Times New Roman" w:hAnsi="Times New Roman"/>
-                <w:sz w:val="18"/>
-              </w:rPr>
-              <w:t>Supported</w:t>
+                <w:b w:val="0"/>
+                <w:sz w:val="18"/>
+              </w:rPr>
+              <w:t>Significant</w:t>
             </w:r>
           </w:p>
         </w:tc>
@@ -8473,9 +8482,10 @@
             <w:r>
               <w:rPr>
                 <w:rFonts w:ascii="Times New Roman" w:hAnsi="Times New Roman"/>
-                <w:sz w:val="18"/>
-              </w:rPr>
-              <w:t>H3</w:t>
+                <w:b w:val="0"/>
+                <w:sz w:val="18"/>
+              </w:rPr>
+              <w:t>H1</w:t>
             </w:r>
           </w:p>
         </w:tc>
@@ -8593,9 +8603,10 @@
             <w:r>
               <w:rPr>
                 <w:rFonts w:ascii="Times New Roman" w:hAnsi="Times New Roman"/>
-                <w:sz w:val="18"/>
-              </w:rPr>
-              <w:t>Not supported</w:t>
+                <w:b w:val="0"/>
+                <w:sz w:val="18"/>
+              </w:rPr>
+              <w:t>Not supported (direct)</w:t>
             </w:r>
           </w:p>
         </w:tc>
@@ -8610,9 +8621,10 @@
             <w:r>
               <w:rPr>
                 <w:rFonts w:ascii="Times New Roman" w:hAnsi="Times New Roman"/>
-                <w:sz w:val="18"/>
-              </w:rPr>
-              <w:t>H4</w:t>
+                <w:b w:val="0"/>
+                <w:sz w:val="18"/>
+              </w:rPr>
+              <w:t>H2</w:t>
             </w:r>
           </w:p>
         </w:tc>
@@ -8730,9 +8742,10 @@
             <w:r>
               <w:rPr>
                 <w:rFonts w:ascii="Times New Roman" w:hAnsi="Times New Roman"/>
-                <w:sz w:val="18"/>
-              </w:rPr>
-              <w:t>Not supported</w:t>
+                <w:b w:val="0"/>
+                <w:sz w:val="18"/>
+              </w:rPr>
+              <w:t>Not supported (direct)</w:t>
             </w:r>
           </w:p>
         </w:tc>
@@ -8752,7 +8765,7 @@
           <w:rFonts w:ascii="Times New Roman" w:hAnsi="Times New Roman"/>
           <w:sz w:val="22"/>
         </w:rPr>
-        <w:t>Three results stand out. First, satisfaction is the proximal driver of continuance: BSAT → BSUC is the strongest path (β = 0.476, p &lt; .001) with a medium-to-large effect (f² = 0.256). Second, experience dominates engagement as an antecedent of satisfaction: UX → BSAT (β = 0.393) is roughly 2.5× the size of UE → BSAT (β = 0.157). Third, neither antecedent exerts a significant direct effect on continuance once satisfaction is accounted for (H3, H4), foreshadowing full mediation.</w:t>
+        <w:t>Three results stand out. First, satisfaction is the proximal driver of continuance: BSAT → BSUC is the strongest path (β = 0.476, p &lt; .001) with a medium-to-large effect (f² = 0.256). Second, experience dominates engagement as an antecedent of satisfaction: UX → BSAT (β = 0.393) is roughly 2.5× the size of UE → BSAT (β = 0.157). Third, neither antecedent exerts a significant direct effect on continuance once satisfaction is accounted for (H1, H2), foreshadowing full mediation.</w:t>
       </w:r>
     </w:p>
     <w:p>
@@ -8964,6 +8977,13 @@
         </w:rPr>
         <w:t>Following Zhao et al. (2010) and Nitzl et al. (2016), mediation was tested on the bootstrapped indirect effects. Both specific indirect paths through satisfaction are significant (Table 11): UE → BSAT → BSUC (indirect = 0.075, p = .007) and UX → BSAT → BSUC (indirect = 0.187, p &lt; .001). Because in each case the indirect effect is significant while the direct effect is not, the data indicate full (indirect-only) mediation: satisfaction fully transmits the influence of both experience and engagement onto continuance.</w:t>
       </w:r>
+      <w:r>
+        <w:rPr>
+          <w:rFonts w:ascii="Times New Roman" w:hAnsi="Times New Roman"/>
+          <w:sz w:val="22"/>
+        </w:rPr>
+        <w:t xml:space="preserve"> In hypothesis terms, this supports H3: brand satisfaction fully mediates the effects of both engagement (H3a) and experience (H3b) on continuance.</w:t>
+      </w:r>
     </w:p>
     <w:p>
       <w:pPr>
@@ -9484,6 +9504,13 @@
           <w:sz w:val="22"/>
         </w:rPr>
         <w:t>The total effects on continuance rank the antecedents as BSAT (0.476) &gt; UX (0.282) &gt; UE (0.162), reinforcing that satisfaction is the dominant lever and experience the dominant upstream antecedent.</w:t>
+      </w:r>
+      <w:r>
+        <w:rPr>
+          <w:rFonts w:ascii="Times New Roman" w:hAnsi="Times New Roman"/>
+          <w:sz w:val="22"/>
+        </w:rPr>
+        <w:t xml:space="preserve"> Accordingly, the hypothesised direct effects H1 (UE → BSUC) and H2 (UX → BSUC) are not supported, whereas H3 (mediation via brand satisfaction) is supported for both antecedents; the total effects of UE and UX on continuance are nonetheless positive and significant (0.162 and 0.282), but operate entirely through satisfaction.</w:t>
       </w:r>
     </w:p>
     <w:p>

</xml_diff>